<commit_message>
Fix: replace hardcoded project names with placeholder
</commit_message>
<xml_diff>
--- a/Template.docx
+++ b/Template.docx
@@ -2607,7 +2607,7 @@
         <w:rPr>
           <w:lang w:val="fr-CA"/>
         </w:rPr>
-        <w:t>Le mandat consiste à réaliser l’inspection quinquennale des ancrages permanents en toiture du bâtiment CONDOS M9 – Phase 3, destinés à l’utilisation d’équipements d’accès suspendus. Les travaux comprennent l’inspection visuelle des composantes accessibles, la vérification de leur état apparent ainsi que la réalisation d’essais de charge, conformément aux exigences applicables. Un rapport technique présentant les constats et recommandations est produit à la suite de l’intervention.</w:t>
+        <w:t>Le mandat consiste à réaliser l’inspection quinquennale des ancrages permanents en toiture du bâtiment {{Project_Name}}, destinés à l’utilisation d’équipements d’accès suspendus. Les travaux comprennent l’inspection visuelle des composantes accessibles, la vérification de leur état apparent ainsi que la réalisation d’essais de charge, conformément aux exigences applicables. Un rapport technique présentant les constats et recommandations est produit à la suite de l’intervention.</w:t>
       </w:r>
     </w:p>
     <w:p>
@@ -3613,7 +3613,7 @@
           <w:lang w:val="fr-CA"/>
           <w14:ligatures w14:val="none"/>
         </w:rPr>
-        <w:t>Attestation de conformité émise par INTO 1972 Inc., datée du 3 octobre 2023, concernant les 3 bossoirs et 3 adaptateurs du projet Condos M9, Phase 3, 71 rue Duke, Montréal.</w:t>
+        <w:t>Attestation de conformité émise par INTO 1972 Inc., datée du 3 octobre 2023, concernant les 3 bossoirs et 3 adaptateurs du projet {{Project_Name}}, 71 rue Duke, Montréal.</w:t>
       </w:r>
     </w:p>
     <w:p>
@@ -3646,7 +3646,7 @@
           <w:lang w:val="fr-CA"/>
           <w14:ligatures w14:val="none"/>
         </w:rPr>
-        <w:t>Plan INTO intitulé « Bossoirs et adaptateurs – nouveau système », préparé pour Condos M9 Phase 3 – 71 rue Duke, Montréal, incluant les détails des bossoirs, adaptateurs et références normatives applicables.</w:t>
+        <w:t>Plan INTO intitulé « Bossoirs et adaptateurs – nouveau système », préparé pour {{Project_Name}} – 71 rue Duke, Montréal, incluant les détails des bossoirs, adaptateurs et références normatives applicables.</w:t>
       </w:r>
     </w:p>
     <w:p>

</xml_diff>

<commit_message>
Remove Figure 4a paragraph from template
</commit_message>
<xml_diff>
--- a/Template.docx
+++ b/Template.docx
@@ -4175,70 +4175,6 @@
           <w:lang w:val="fr-CA"/>
         </w:rPr>
         <w:t>}}</w:t>
-      </w:r>
-    </w:p>
-    <w:p>
-      <w:pPr>
-        <w:pStyle w:val="NormalWeb"/>
-        <w:spacing w:line="360" w:lineRule="auto"/>
-        <w:jc w:val="center"/>
-        <w:rPr>
-          <w:rStyle w:val="Strong"/>
-          <w:b w:val="0"/>
-          <w:bCs w:val="0"/>
-          <w:lang w:val="fr-CA"/>
-        </w:rPr>
-      </w:pPr>
-      <w:r>
-        <w:rPr>
-          <w:rStyle w:val="Strong"/>
-          <w:b w:val="0"/>
-          <w:bCs w:val="0"/>
-          <w:lang w:val="fr-CA"/>
-        </w:rPr>
-        <w:t xml:space="preserve">Figure </w:t>
-      </w:r>
-      <w:r>
-        <w:rPr>
-          <w:rStyle w:val="Strong"/>
-          <w:b w:val="0"/>
-          <w:bCs w:val="0"/>
-          <w:lang w:val="fr-CA"/>
-        </w:rPr>
-        <w:t>4a et 4</w:t>
-      </w:r>
-      <w:r>
-        <w:rPr>
-          <w:rStyle w:val="Strong"/>
-          <w:b w:val="0"/>
-          <w:bCs w:val="0"/>
-          <w:lang w:val="fr-CA"/>
-        </w:rPr>
-        <w:t>b</w:t>
-      </w:r>
-      <w:r>
-        <w:rPr>
-          <w:rStyle w:val="Strong"/>
-          <w:b w:val="0"/>
-          <w:bCs w:val="0"/>
-          <w:lang w:val="fr-CA"/>
-        </w:rPr>
-        <w:t>.</w:t>
-      </w:r>
-      <w:r>
-        <w:rPr>
-          <w:rStyle w:val="Strong"/>
-          <w:b w:val="0"/>
-          <w:bCs w:val="0"/>
-          <w:lang w:val="fr-CA"/>
-        </w:rPr>
-        <w:t xml:space="preserve"> </w:t>
-      </w:r>
-      <w:r>
-        <w:rPr>
-          <w:lang w:val="fr-CA"/>
-        </w:rPr>
-        <w:t>L’utilisation de ces équipements est proscrite dans le cadre du présent projet.</w:t>
       </w:r>
     </w:p>
     <w:p>

</xml_diff>